<commit_message>
Text-box Layout: act on code review
- Record the NBSP only for dates that went through format_date, never
  for a literal, which is printed verbatim whatever it holds; the
  clean-manifest test now carries a literal with an NBSP to pin that.
- Unplaceable fragments share one trailing text box (location
  "text-box-end") instead of copying single-column's body-end, so the
  placement is the Layout's own. c09 and c11 regenerated; the other
  ten pairs are byte-identical.
- The writer allocates shape ids from 1025 as Word does, instead of
  call sites passing magic strings.
- One namespace naming scheme (_W is the braced prefix, as in base.py)
  and no f-string/str.format mix in the text-box template.
- The vacuous reload test replaced by a no-images assertion over every
  Candidate, which the spec asks of every non-photo Layout.

Co-Authored-By: Claude Opus 5 <noreply@anthropic.com>
Claude-Session: https://claude.ai/code/session_016pH63xup3DLhwEedJo3bHT
</commit_message>
<xml_diff>
--- a/fixtures/generated/c09__text-box.docx
+++ b/fixtures/generated/c09__text-box.docx
@@ -333,12 +333,24 @@
     </w:p>
     <w:p>
       <w:r>
-        <w:t>Page 1 of 2</w:t>
-      </w:r>
-    </w:p>
-    <w:p>
-      <w:r>
-        <w:t>Fortune favours the prepared.</w:t>
+        <w:pict>
+          <v:shape id="_x0000_s1027" type="#_x0000_t202" style="width:450pt;height:40pt;mso-position-horizontal:left" strokecolor="#7f7f7f">
+            <v:textbox style="mso-fit-shape-to-text:t" inset="5pt,3pt,5pt,3pt">
+              <w:txbxContent>
+                <w:p>
+                  <w:r>
+                    <w:t xml:space="preserve">Page 1 of 2</w:t>
+                  </w:r>
+                </w:p>
+                <w:p>
+                  <w:r>
+                    <w:t xml:space="preserve">Fortune favours the prepared.</w:t>
+                  </w:r>
+                </w:p>
+              </w:txbxContent>
+            </v:textbox>
+          </v:shape>
+        </w:pict>
       </w:r>
     </w:p>
     <w:sectPr>

</xml_diff>